<commit_message>
First draft of discussion and perspectives is done
</commit_message>
<xml_diff>
--- a/coauthorship_forms/Study_1_Declaration_of_co-authorship_PhD_dissertations_October_2019.docx
+++ b/coauthorship_forms/Study_1_Declaration_of_co-authorship_PhD_dissertations_October_2019.docx
@@ -1373,17 +1373,7 @@
           <w:szCs w:val="21"/>
           <w:lang w:val="en-GB"/>
         </w:rPr>
-        <w:t>to the elements of this article/</w:t>
-      </w:r>
-      <w:proofErr w:type="gramStart"/>
-      <w:r>
-        <w:rPr>
-          <w:rFonts w:ascii="Georgia" w:hAnsi="Georgia"/>
-          <w:sz w:val="21"/>
-          <w:szCs w:val="21"/>
-          <w:lang w:val="en-GB"/>
-        </w:rPr>
-        <w:t>manuscript</w:t>
+        <w:t>to the elements of this article/manuscript</w:t>
       </w:r>
       <w:r>
         <w:rPr>
@@ -1413,7 +1403,6 @@
         </w:rPr>
         <w:t>and</w:t>
       </w:r>
-      <w:proofErr w:type="gramEnd"/>
       <w:r>
         <w:rPr>
           <w:rFonts w:ascii="Georgia" w:hAnsi="Georgia"/>
@@ -1964,10 +1953,9 @@
             </w:r>
             <w:r>
               <w:rPr>
-                <w:noProof/>
-                <w:lang w:val="en-US"/>
-              </w:rPr>
-              <w:t>C</w:t>
+                <w:lang w:val="en-US"/>
+              </w:rPr>
+              <w:t>B</w:t>
             </w:r>
             <w:r>
               <w:rPr>
@@ -2854,39 +2842,7 @@
                 <w:sz w:val="21"/>
                 <w:szCs w:val="21"/>
               </w:rPr>
-              <w:t> </w:t>
-            </w:r>
-            <w:r>
-              <w:rPr>
-                <w:noProof/>
-                <w:sz w:val="21"/>
-                <w:szCs w:val="21"/>
-              </w:rPr>
-              <w:t> </w:t>
-            </w:r>
-            <w:r>
-              <w:rPr>
-                <w:noProof/>
-                <w:sz w:val="21"/>
-                <w:szCs w:val="21"/>
-              </w:rPr>
-              <w:t> </w:t>
-            </w:r>
-            <w:r>
-              <w:rPr>
-                <w:noProof/>
-                <w:sz w:val="21"/>
-                <w:szCs w:val="21"/>
-              </w:rPr>
-              <w:t> </w:t>
-            </w:r>
-            <w:r>
-              <w:rPr>
-                <w:noProof/>
-                <w:sz w:val="21"/>
-                <w:szCs w:val="21"/>
-              </w:rPr>
-              <w:t> </w:t>
+              <w:t>Helene Bei Thomsen</w:t>
             </w:r>
             <w:r>
               <w:rPr>
@@ -3072,43 +3028,11 @@
             </w:r>
             <w:r>
               <w:rPr>
-                <w:noProof/>
-                <w:sz w:val="21"/>
-                <w:szCs w:val="21"/>
-              </w:rPr>
-              <w:t> </w:t>
-            </w:r>
-            <w:r>
-              <w:rPr>
-                <w:noProof/>
-                <w:sz w:val="21"/>
-                <w:szCs w:val="21"/>
-              </w:rPr>
-              <w:t> </w:t>
-            </w:r>
-            <w:r>
-              <w:rPr>
-                <w:noProof/>
-                <w:sz w:val="21"/>
-                <w:szCs w:val="21"/>
-              </w:rPr>
-              <w:t> </w:t>
-            </w:r>
-            <w:r>
-              <w:rPr>
-                <w:noProof/>
-                <w:sz w:val="21"/>
-                <w:szCs w:val="21"/>
-              </w:rPr>
-              <w:t> </w:t>
-            </w:r>
-            <w:r>
-              <w:rPr>
-                <w:noProof/>
-                <w:sz w:val="21"/>
-                <w:szCs w:val="21"/>
-              </w:rPr>
-              <w:t> </w:t>
+                <w:rFonts w:ascii="Georgia" w:hAnsi="Georgia"/>
+                <w:sz w:val="21"/>
+                <w:szCs w:val="21"/>
+              </w:rPr>
+              <w:t>Anders Aasted Isaksen</w:t>
             </w:r>
             <w:r>
               <w:rPr>
@@ -3298,39 +3222,7 @@
                 <w:sz w:val="21"/>
                 <w:szCs w:val="21"/>
               </w:rPr>
-              <w:t> </w:t>
-            </w:r>
-            <w:r>
-              <w:rPr>
-                <w:noProof/>
-                <w:sz w:val="21"/>
-                <w:szCs w:val="21"/>
-              </w:rPr>
-              <w:t> </w:t>
-            </w:r>
-            <w:r>
-              <w:rPr>
-                <w:noProof/>
-                <w:sz w:val="21"/>
-                <w:szCs w:val="21"/>
-              </w:rPr>
-              <w:t> </w:t>
-            </w:r>
-            <w:r>
-              <w:rPr>
-                <w:noProof/>
-                <w:sz w:val="21"/>
-                <w:szCs w:val="21"/>
-              </w:rPr>
-              <w:t> </w:t>
-            </w:r>
-            <w:r>
-              <w:rPr>
-                <w:noProof/>
-                <w:sz w:val="21"/>
-                <w:szCs w:val="21"/>
-              </w:rPr>
-              <w:t> </w:t>
+              <w:t>Adam Hulman</w:t>
             </w:r>
             <w:r>
               <w:rPr>

</xml_diff>